<commit_message>
Topic 09 — Self-Attention with Trainable Weights (Q/K/V)
</commit_message>
<xml_diff>
--- a/09_self_attention/Topic9_SelfAttentionQKV.docx
+++ b/09_self_attention/Topic9_SelfAttentionQKV.docx
@@ -600,6 +600,7 @@
     <w:p>
       <w:pPr>
         <w:pStyle w:val="Heading1"/>
+        <w:keepNext/>
         <w:pBdr>
           <w:bottom w:val="single" w:color="2E75B6" w:sz="8" w:space="6"/>
         </w:pBdr>
@@ -619,6 +620,7 @@
     </w:p>
     <w:p>
       <w:pPr>
+        <w:keepLines/>
         <w:spacing w:before="80" w:after="100"/>
       </w:pPr>
       <w:r>
@@ -641,6 +643,7 @@
     </w:p>
     <w:p>
       <w:pPr>
+        <w:keepLines/>
         <w:spacing w:before="80" w:after="100"/>
       </w:pPr>
       <w:r>
@@ -906,6 +909,7 @@
     <w:p>
       <w:pPr>
         <w:pStyle w:val="Heading1"/>
+        <w:keepNext/>
         <w:pBdr>
           <w:bottom w:val="single" w:color="2E75B6" w:sz="8" w:space="6"/>
         </w:pBdr>
@@ -925,6 +929,7 @@
     </w:p>
     <w:p>
       <w:pPr>
+        <w:keepLines/>
         <w:spacing w:before="80" w:after="100"/>
       </w:pPr>
       <w:r>
@@ -1264,6 +1269,7 @@
     </w:p>
     <w:p>
       <w:pPr>
+        <w:keepLines/>
         <w:spacing w:before="80" w:after="100"/>
       </w:pPr>
       <w:r>
@@ -1287,6 +1293,7 @@
     <w:p>
       <w:pPr>
         <w:pStyle w:val="Heading1"/>
+        <w:keepNext/>
         <w:pBdr>
           <w:bottom w:val="single" w:color="2E75B6" w:sz="8" w:space="6"/>
         </w:pBdr>
@@ -1306,6 +1313,7 @@
     </w:p>
     <w:p>
       <w:pPr>
+        <w:keepLines/>
         <w:spacing w:before="80" w:after="100"/>
       </w:pPr>
       <w:r>
@@ -2243,6 +2251,7 @@
     <w:p>
       <w:pPr>
         <w:pStyle w:val="Heading1"/>
+        <w:keepNext/>
         <w:pBdr>
           <w:bottom w:val="single" w:color="2E75B6" w:sz="8" w:space="6"/>
         </w:pBdr>
@@ -2262,6 +2271,7 @@
     </w:p>
     <w:p>
       <w:pPr>
+        <w:keepLines/>
         <w:spacing w:before="80" w:after="100"/>
       </w:pPr>
       <w:r>
@@ -2285,6 +2295,7 @@
     <w:p>
       <w:pPr>
         <w:pStyle w:val="Heading2"/>
+        <w:keepNext/>
         <w:spacing w:before="280" w:after="120"/>
       </w:pPr>
       <w:r>
@@ -2513,6 +2524,7 @@
     <w:p>
       <w:pPr>
         <w:pStyle w:val="Heading2"/>
+        <w:keepNext/>
         <w:spacing w:before="280" w:after="120"/>
       </w:pPr>
       <w:r>
@@ -2981,6 +2993,7 @@
     <w:p>
       <w:pPr>
         <w:pStyle w:val="Heading1"/>
+        <w:keepNext/>
         <w:pBdr>
           <w:bottom w:val="single" w:color="2E75B6" w:sz="8" w:space="6"/>
         </w:pBdr>
@@ -3000,6 +3013,7 @@
     </w:p>
     <w:p>
       <w:pPr>
+        <w:keepLines/>
         <w:spacing w:before="80" w:after="100"/>
       </w:pPr>
       <w:r>
@@ -3351,6 +3365,7 @@
     <w:p>
       <w:pPr>
         <w:pStyle w:val="Heading2"/>
+        <w:keepNext/>
         <w:spacing w:before="280" w:after="120"/>
       </w:pPr>
       <w:r>
@@ -3639,6 +3654,7 @@
     <w:p>
       <w:pPr>
         <w:pStyle w:val="Heading2"/>
+        <w:keepNext/>
         <w:spacing w:before="280" w:after="120"/>
       </w:pPr>
       <w:r>
@@ -3927,6 +3943,7 @@
     <w:p>
       <w:pPr>
         <w:pStyle w:val="Heading1"/>
+        <w:keepNext/>
         <w:pBdr>
           <w:bottom w:val="single" w:color="2E75B6" w:sz="8" w:space="6"/>
         </w:pBdr>
@@ -3946,6 +3963,7 @@
     </w:p>
     <w:p>
       <w:pPr>
+        <w:keepLines/>
         <w:spacing w:before="80" w:after="100"/>
       </w:pPr>
       <w:r>
@@ -4040,6 +4058,7 @@
     <w:p>
       <w:pPr>
         <w:pStyle w:val="Heading2"/>
+        <w:keepNext/>
         <w:spacing w:before="280" w:after="120"/>
       </w:pPr>
       <w:r>
@@ -4880,6 +4899,7 @@
     <w:p>
       <w:pPr>
         <w:pStyle w:val="Heading1"/>
+        <w:keepNext/>
         <w:pBdr>
           <w:bottom w:val="single" w:color="2E75B6" w:sz="8" w:space="6"/>
         </w:pBdr>
@@ -4899,6 +4919,7 @@
     </w:p>
     <w:p>
       <w:pPr>
+        <w:keepLines/>
         <w:spacing w:before="80" w:after="100"/>
       </w:pPr>
       <w:r>
@@ -5566,6 +5587,7 @@
     <w:p>
       <w:pPr>
         <w:pStyle w:val="Heading1"/>
+        <w:keepNext/>
         <w:pBdr>
           <w:bottom w:val="single" w:color="2E75B6" w:sz="8" w:space="6"/>
         </w:pBdr>
@@ -6243,6 +6265,7 @@
     <w:p>
       <w:pPr>
         <w:pStyle w:val="Heading1"/>
+        <w:keepNext/>
         <w:pBdr>
           <w:bottom w:val="single" w:color="2E75B6" w:sz="8" w:space="6"/>
         </w:pBdr>
@@ -6262,6 +6285,7 @@
     </w:p>
     <w:p>
       <w:pPr>
+        <w:keepLines/>
         <w:spacing w:before="80" w:after="100"/>
       </w:pPr>
       <w:r>
@@ -6841,6 +6865,7 @@
     <w:p>
       <w:pPr>
         <w:pStyle w:val="Heading1"/>
+        <w:keepNext/>
         <w:pBdr>
           <w:bottom w:val="single" w:color="2E75B6" w:sz="8" w:space="6"/>
         </w:pBdr>
@@ -6860,6 +6885,7 @@
     </w:p>
     <w:p>
       <w:pPr>
+        <w:keepLines/>
         <w:spacing w:before="80" w:after="100"/>
       </w:pPr>
       <w:r>
@@ -8122,6 +8148,7 @@
     <w:p>
       <w:pPr>
         <w:pStyle w:val="Heading1"/>
+        <w:keepNext/>
         <w:pBdr>
           <w:bottom w:val="single" w:color="2E75B6" w:sz="8" w:space="6"/>
         </w:pBdr>
@@ -9353,6 +9380,7 @@
     <w:p>
       <w:pPr>
         <w:pStyle w:val="Heading1"/>
+        <w:keepNext/>
         <w:pBdr>
           <w:bottom w:val="single" w:color="2E75B6" w:sz="8" w:space="6"/>
         </w:pBdr>
@@ -9547,6 +9575,7 @@
     <w:p>
       <w:pPr>
         <w:pStyle w:val="Heading1"/>
+        <w:keepNext/>
         <w:pBdr>
           <w:bottom w:val="single" w:color="2E75B6" w:sz="8" w:space="6"/>
         </w:pBdr>
@@ -9673,6 +9702,7 @@
     <w:p>
       <w:pPr>
         <w:pStyle w:val="Heading1"/>
+        <w:keepNext/>
         <w:pBdr>
           <w:bottom w:val="single" w:color="2E75B6" w:sz="8" w:space="6"/>
         </w:pBdr>

</xml_diff>